<commit_message>
Troubleshooting: what to do when a Cloudflare build fails
Co-Authored-By: Claude Opus 5.5 <noreply@anthropic.com>
Claude-Session: https://claude.ai/code/session_016MSitiN4QkJHe8WqEGz9RU
</commit_message>
<xml_diff>
--- a/lead-routing/Momos Lead Routing - Troubleshooting Guide.docx
+++ b/lead-routing/Momos Lead Routing - Troubleshooting Guide.docx
@@ -2,7 +2,7 @@
 <file path=word/document.xml><?xml version="1.0" encoding="utf-8"?>
 <w:document xmlns:w="http://schemas.openxmlformats.org/wordprocessingml/2006/main" xmlns:m="http://schemas.openxmlformats.org/officeDocument/2006/math" xmlns:r="http://schemas.openxmlformats.org/officeDocument/2006/relationships" xmlns:o="urn:schemas-microsoft-com:office:office" xmlns:v="urn:schemas-microsoft-com:vml" xmlns:w10="urn:schemas-microsoft-com:office:word" xmlns:a="http://schemas.openxmlformats.org/drawingml/2006/main" xmlns:pic="http://schemas.openxmlformats.org/drawingml/2006/picture" xmlns:wp="http://schemas.openxmlformats.org/drawingml/2006/wordprocessingDrawing">
   <w:body>
-    <w:bookmarkStart w:id="40" w:name="Xbd2fe1ab67c06b8daf3ba1d913602da1046768d"/>
+    <w:bookmarkStart w:id="41" w:name="Xbd2fe1ab67c06b8daf3ba1d913602da1046768d"/>
     <w:p>
       <w:pPr>
         <w:pStyle w:val="Heading1"/>
@@ -581,7 +581,7 @@
       </w:r>
     </w:p>
     <w:bookmarkEnd w:id="24"/>
-    <w:bookmarkStart w:id="36" w:name="X95cdb6347f5e67ed23eac0a72d283963529439f"/>
+    <w:bookmarkStart w:id="37" w:name="X95cdb6347f5e67ed23eac0a72d283963529439f"/>
     <w:p>
       <w:pPr>
         <w:pStyle w:val="Heading2"/>
@@ -2491,12 +2491,186 @@
       </w:r>
     </w:p>
     <w:bookmarkEnd w:id="34"/>
-    <w:bookmarkStart w:id="35" w:name="X51ddaecf7fb6399ba2c2fa74b8bcd2d797d6997"/>
+    <w:bookmarkStart w:id="35" w:name="Xc2fb214cea858f5ebc394e81c38ffbef5e30738"/>
     <w:p>
       <w:pPr>
         <w:pStyle w:val="Heading3"/>
       </w:pPr>
       <w:r>
+        <w:t xml:space="preserve">Problem 7b: Cloudflare shows "Latest build failed"</w:t>
+      </w:r>
+    </w:p>
+    <w:p>
+      <w:pPr>
+        <w:pStyle w:val="FirstParagraph"/>
+      </w:pPr>
+      <w:r>
+        <w:rPr>
+          <w:bCs/>
+          <w:b/>
+        </w:rPr>
+        <w:t xml:space="preserve">What it means:</w:t>
+      </w:r>
+      <w:r>
+        <w:t xml:space="preserve"> </w:t>
+      </w:r>
+      <w:r>
+        <w:t xml:space="preserve">a change pushed to GitHub didn't go live. The previous version keeps running, so visitors aren't affected.</w:t>
+      </w:r>
+    </w:p>
+    <w:p>
+      <w:pPr>
+        <w:numPr>
+          <w:ilvl w:val="0"/>
+          <w:numId w:val="1015"/>
+        </w:numPr>
+        <w:pStyle w:val="Compact"/>
+      </w:pPr>
+      <w:r>
+        <w:t xml:space="preserve">Cloudflare → Workers &amp; Pages →</w:t>
+      </w:r>
+      <w:r>
+        <w:t xml:space="preserve"> </w:t>
+      </w:r>
+      <w:r>
+        <w:rPr>
+          <w:bCs/>
+          <w:b/>
+        </w:rPr>
+        <w:t xml:space="preserve">momos-lead-routing</w:t>
+      </w:r>
+      <w:r>
+        <w:t xml:space="preserve"> </w:t>
+      </w:r>
+      <w:r>
+        <w:t xml:space="preserve">→</w:t>
+      </w:r>
+      <w:r>
+        <w:t xml:space="preserve"> </w:t>
+      </w:r>
+      <w:r>
+        <w:rPr>
+          <w:bCs/>
+          <w:b/>
+        </w:rPr>
+        <w:t xml:space="preserve">Deployments</w:t>
+      </w:r>
+      <w:r>
+        <w:t xml:space="preserve">. Click the red</w:t>
+      </w:r>
+      <w:r>
+        <w:t xml:space="preserve"> </w:t>
+      </w:r>
+      <w:r>
+        <w:rPr>
+          <w:bCs/>
+          <w:b/>
+        </w:rPr>
+        <w:t xml:space="preserve">Build ↗</w:t>
+      </w:r>
+      <w:r>
+        <w:t xml:space="preserve"> </w:t>
+      </w:r>
+      <w:r>
+        <w:t xml:space="preserve">next to the failed row and read the red lines.</w:t>
+      </w:r>
+    </w:p>
+    <w:p>
+      <w:pPr>
+        <w:numPr>
+          <w:ilvl w:val="0"/>
+          <w:numId w:val="1015"/>
+        </w:numPr>
+        <w:pStyle w:val="Compact"/>
+      </w:pPr>
+      <w:r>
+        <w:rPr>
+          <w:rStyle w:val="VerbatimChar"/>
+          <w:bCs/>
+          <w:b/>
+        </w:rPr>
+        <w:t xml:space="preserve">504 Gateway Timeout</w:t>
+      </w:r>
+      <w:r>
+        <w:t xml:space="preserve"> </w:t>
+      </w:r>
+      <w:r>
+        <w:t xml:space="preserve">or</w:t>
+      </w:r>
+      <w:r>
+        <w:t xml:space="preserve"> </w:t>
+      </w:r>
+      <w:r>
+        <w:rPr>
+          <w:rStyle w:val="VerbatimChar"/>
+          <w:bCs/>
+          <w:b/>
+        </w:rPr>
+        <w:t xml:space="preserve">malformed response from the API</w:t>
+      </w:r>
+      <w:r>
+        <w:t xml:space="preserve">: Cloudflare had a hiccup, not us. Any new push to</w:t>
+      </w:r>
+      <w:r>
+        <w:t xml:space="preserve"> </w:t>
+      </w:r>
+      <w:r>
+        <w:rPr>
+          <w:rStyle w:val="VerbatimChar"/>
+        </w:rPr>
+        <w:t xml:space="preserve">main</w:t>
+      </w:r>
+      <w:r>
+        <w:t xml:space="preserve"> </w:t>
+      </w:r>
+      <w:r>
+        <w:t xml:space="preserve">(even a small doc edit in GitHub) starts a fresh build.</w:t>
+      </w:r>
+    </w:p>
+    <w:p>
+      <w:pPr>
+        <w:numPr>
+          <w:ilvl w:val="0"/>
+          <w:numId w:val="1015"/>
+        </w:numPr>
+        <w:pStyle w:val="Compact"/>
+      </w:pPr>
+      <w:r>
+        <w:rPr>
+          <w:bCs/>
+          <w:b/>
+        </w:rPr>
+        <w:t xml:space="preserve">Anything else</w:t>
+      </w:r>
+      <w:r>
+        <w:t xml:space="preserve"> </w:t>
+      </w:r>
+      <w:r>
+        <w:t xml:space="preserve">(e.g. "missing a</w:t>
+      </w:r>
+      <w:r>
+        <w:t xml:space="preserve"> </w:t>
+      </w:r>
+      <w:r>
+        <w:rPr>
+          <w:rStyle w:val="VerbatimChar"/>
+        </w:rPr>
+        <w:t xml:space="preserve">previews</w:t>
+      </w:r>
+      <w:r>
+        <w:t xml:space="preserve"> </w:t>
+      </w:r>
+      <w:r>
+        <w:t xml:space="preserve">block"): send the red lines to Vincent.</w:t>
+      </w:r>
+    </w:p>
+    <w:bookmarkEnd w:id="35"/>
+    <w:bookmarkStart w:id="36" w:name="X51ddaecf7fb6399ba2c2fa74b8bcd2d797d6997"/>
+    <w:p>
+      <w:pPr>
+        <w:pStyle w:val="Heading3"/>
+      </w:pPr>
+      <w:r>
         <w:t xml:space="preserve">Problem 8: The Anthropic bill suddenly jumps</w:t>
       </w:r>
     </w:p>
@@ -2504,7 +2678,7 @@
       <w:pPr>
         <w:numPr>
           <w:ilvl w:val="0"/>
-          <w:numId w:val="1015"/>
+          <w:numId w:val="1016"/>
         </w:numPr>
         <w:pStyle w:val="Compact"/>
       </w:pPr>
@@ -2539,7 +2713,7 @@
       <w:pPr>
         <w:numPr>
           <w:ilvl w:val="0"/>
-          <w:numId w:val="1015"/>
+          <w:numId w:val="1016"/>
         </w:numPr>
         <w:pStyle w:val="Compact"/>
       </w:pPr>
@@ -2551,7 +2725,7 @@
       <w:pPr>
         <w:numPr>
           <w:ilvl w:val="0"/>
-          <w:numId w:val="1015"/>
+          <w:numId w:val="1016"/>
         </w:numPr>
         <w:pStyle w:val="Compact"/>
       </w:pPr>
@@ -2566,9 +2740,9 @@
         </w:pict>
       </w:r>
     </w:p>
-    <w:bookmarkEnd w:id="35"/>
     <w:bookmarkEnd w:id="36"/>
-    <w:bookmarkStart w:id="37" w:name="Xbe5a11d57ac4af6ae5351e4a7c0ecd997987c80"/>
+    <w:bookmarkEnd w:id="37"/>
+    <w:bookmarkStart w:id="38" w:name="Xbe5a11d57ac4af6ae5351e4a7c0ecd997987c80"/>
     <w:p>
       <w:pPr>
         <w:pStyle w:val="Heading2"/>
@@ -2930,8 +3104,8 @@
         </w:pict>
       </w:r>
     </w:p>
-    <w:bookmarkEnd w:id="37"/>
-    <w:bookmarkStart w:id="38" w:name="X224553b6790739977386254a7075f98068438d7"/>
+    <w:bookmarkEnd w:id="38"/>
+    <w:bookmarkStart w:id="39" w:name="X224553b6790739977386254a7075f98068438d7"/>
     <w:p>
       <w:pPr>
         <w:pStyle w:val="Heading2"/>
@@ -2944,7 +3118,7 @@
       <w:pPr>
         <w:numPr>
           <w:ilvl w:val="0"/>
-          <w:numId w:val="1016"/>
+          <w:numId w:val="1017"/>
         </w:numPr>
         <w:pStyle w:val="Compact"/>
       </w:pPr>
@@ -2966,7 +3140,7 @@
       <w:pPr>
         <w:numPr>
           <w:ilvl w:val="0"/>
-          <w:numId w:val="1016"/>
+          <w:numId w:val="1017"/>
         </w:numPr>
         <w:pStyle w:val="Compact"/>
       </w:pPr>
@@ -3000,7 +3174,7 @@
       <w:pPr>
         <w:numPr>
           <w:ilvl w:val="0"/>
-          <w:numId w:val="1016"/>
+          <w:numId w:val="1017"/>
         </w:numPr>
         <w:pStyle w:val="Compact"/>
       </w:pPr>
@@ -3025,8 +3199,8 @@
         </w:pict>
       </w:r>
     </w:p>
-    <w:bookmarkEnd w:id="38"/>
-    <w:bookmarkStart w:id="39" w:name="Xccd7abcb1eed6664058f03f93af5f15708cef02"/>
+    <w:bookmarkEnd w:id="39"/>
+    <w:bookmarkStart w:id="40" w:name="Xccd7abcb1eed6664058f03f93af5f15708cef02"/>
     <w:p>
       <w:pPr>
         <w:pStyle w:val="Heading2"/>
@@ -3047,7 +3221,7 @@
       <w:pPr>
         <w:numPr>
           <w:ilvl w:val="0"/>
-          <w:numId w:val="1017"/>
+          <w:numId w:val="1018"/>
         </w:numPr>
         <w:pStyle w:val="Compact"/>
       </w:pPr>
@@ -3069,7 +3243,7 @@
       <w:pPr>
         <w:numPr>
           <w:ilvl w:val="0"/>
-          <w:numId w:val="1017"/>
+          <w:numId w:val="1018"/>
         </w:numPr>
         <w:pStyle w:val="Compact"/>
       </w:pPr>
@@ -3088,7 +3262,7 @@
       <w:pPr>
         <w:numPr>
           <w:ilvl w:val="0"/>
-          <w:numId w:val="1017"/>
+          <w:numId w:val="1018"/>
         </w:numPr>
         <w:pStyle w:val="Compact"/>
       </w:pPr>
@@ -3100,8 +3274,8 @@
         <w:t xml:space="preserve">What you already tried</w:t>
       </w:r>
     </w:p>
-    <w:bookmarkEnd w:id="39"/>
     <w:bookmarkEnd w:id="40"/>
+    <w:bookmarkEnd w:id="41"/>
     <w:sectPr/>
   </w:body>
 </w:document>
@@ -3661,9 +3835,39 @@
     </w:lvlOverride>
   </w:num>
   <w:num w:numId="1016">
+    <w:abstractNumId w:val="99411"/>
+    <w:lvlOverride w:ilvl="0">
+      <w:startOverride w:val="1"/>
+    </w:lvlOverride>
+    <w:lvlOverride w:ilvl="1">
+      <w:startOverride w:val="1"/>
+    </w:lvlOverride>
+    <w:lvlOverride w:ilvl="2">
+      <w:startOverride w:val="1"/>
+    </w:lvlOverride>
+    <w:lvlOverride w:ilvl="3">
+      <w:startOverride w:val="1"/>
+    </w:lvlOverride>
+    <w:lvlOverride w:ilvl="4">
+      <w:startOverride w:val="1"/>
+    </w:lvlOverride>
+    <w:lvlOverride w:ilvl="5">
+      <w:startOverride w:val="1"/>
+    </w:lvlOverride>
+    <w:lvlOverride w:ilvl="6">
+      <w:startOverride w:val="1"/>
+    </w:lvlOverride>
+    <w:lvlOverride w:ilvl="7">
+      <w:startOverride w:val="1"/>
+    </w:lvlOverride>
+    <w:lvlOverride w:ilvl="8">
+      <w:startOverride w:val="1"/>
+    </w:lvlOverride>
+  </w:num>
+  <w:num w:numId="1017">
     <w:abstractNumId w:val="991"/>
   </w:num>
-  <w:num w:numId="1017">
+  <w:num w:numId="1018">
     <w:abstractNumId w:val="991"/>
   </w:num>
 </w:numbering>

</xml_diff>